<commit_message>
Minor updates on the sectioning
Changes made to how the SA is structured.
</commit_message>
<xml_diff>
--- a/QARA Documents/miRFlow_Software Architecture Draft_0.01.docx
+++ b/QARA Documents/miRFlow_Software Architecture Draft_0.01.docx
@@ -444,47 +444,7 @@
                 <w:sz w:val="20"/>
                 <w:szCs w:val="20"/>
               </w:rPr>
-              <w:t xml:space="preserve">(dd </w:t>
-            </w:r>
-            <w:proofErr w:type="spellStart"/>
-            <w:r>
-              <w:rPr>
-                <w:rFonts w:cs="Calibri"/>
-                <w:b/>
-                <w:sz w:val="20"/>
-                <w:szCs w:val="20"/>
-              </w:rPr>
-              <w:t>Mmm</w:t>
-            </w:r>
-            <w:proofErr w:type="spellEnd"/>
-            <w:r>
-              <w:rPr>
-                <w:rFonts w:cs="Calibri"/>
-                <w:b/>
-                <w:sz w:val="20"/>
-                <w:szCs w:val="20"/>
-              </w:rPr>
-              <w:t xml:space="preserve"> </w:t>
-            </w:r>
-            <w:proofErr w:type="spellStart"/>
-            <w:r>
-              <w:rPr>
-                <w:rFonts w:cs="Calibri"/>
-                <w:b/>
-                <w:sz w:val="20"/>
-                <w:szCs w:val="20"/>
-              </w:rPr>
-              <w:t>yyyy</w:t>
-            </w:r>
-            <w:proofErr w:type="spellEnd"/>
-            <w:r>
-              <w:rPr>
-                <w:rFonts w:cs="Calibri"/>
-                <w:b/>
-                <w:sz w:val="20"/>
-                <w:szCs w:val="20"/>
-              </w:rPr>
-              <w:t>)</w:t>
+              <w:t>(dd Mmm yyyy)</w:t>
             </w:r>
           </w:p>
         </w:tc>
@@ -3201,35 +3161,7 @@
               <w:rPr>
                 <w:rFonts w:eastAsia="Calibri" w:cstheme="minorHAnsi"/>
               </w:rPr>
-              <w:t xml:space="preserve"> </w:t>
-            </w:r>
-            <w:proofErr w:type="spellStart"/>
-            <w:r>
-              <w:rPr>
-                <w:rFonts w:eastAsia="Calibri" w:cstheme="minorHAnsi"/>
-              </w:rPr>
-              <w:t>LifeCycle</w:t>
-            </w:r>
-            <w:proofErr w:type="spellEnd"/>
-            <w:r>
-              <w:rPr>
-                <w:rFonts w:eastAsia="Calibri" w:cstheme="minorHAnsi"/>
-              </w:rPr>
-              <w:t xml:space="preserve"> processes </w:t>
-            </w:r>
-            <w:proofErr w:type="spellStart"/>
-            <w:r>
-              <w:rPr>
-                <w:rFonts w:eastAsia="Calibri" w:cstheme="minorHAnsi"/>
-              </w:rPr>
-              <w:t>inc</w:t>
-            </w:r>
-            <w:proofErr w:type="spellEnd"/>
-            <w:r>
-              <w:rPr>
-                <w:rFonts w:eastAsia="Calibri" w:cstheme="minorHAnsi"/>
-              </w:rPr>
-              <w:t xml:space="preserve"> </w:t>
+              <w:t xml:space="preserve"> LifeCycle processes inc </w:t>
             </w:r>
             <w:r>
               <w:rPr>
@@ -3385,43 +3317,7 @@
           <w:sz w:val="22"/>
           <w:szCs w:val="22"/>
         </w:rPr>
-        <w:t xml:space="preserve"> diagnostic assay. The aim of the software is to process, </w:t>
-      </w:r>
-      <w:proofErr w:type="spellStart"/>
-      <w:r>
-        <w:rPr>
-          <w:rFonts w:asciiTheme="minorHAnsi" w:hAnsiTheme="minorHAnsi" w:cstheme="minorHAnsi"/>
-          <w:sz w:val="22"/>
-          <w:szCs w:val="22"/>
-        </w:rPr>
-        <w:t>analyse</w:t>
-      </w:r>
-      <w:proofErr w:type="spellEnd"/>
-      <w:r>
-        <w:rPr>
-          <w:rFonts w:asciiTheme="minorHAnsi" w:hAnsiTheme="minorHAnsi" w:cstheme="minorHAnsi"/>
-          <w:sz w:val="22"/>
-          <w:szCs w:val="22"/>
-        </w:rPr>
-        <w:t xml:space="preserve">, and </w:t>
-      </w:r>
-      <w:proofErr w:type="spellStart"/>
-      <w:r>
-        <w:rPr>
-          <w:rFonts w:asciiTheme="minorHAnsi" w:hAnsiTheme="minorHAnsi" w:cstheme="minorHAnsi"/>
-          <w:sz w:val="22"/>
-          <w:szCs w:val="22"/>
-        </w:rPr>
-        <w:t>visualise</w:t>
-      </w:r>
-      <w:proofErr w:type="spellEnd"/>
-      <w:r>
-        <w:rPr>
-          <w:rFonts w:asciiTheme="minorHAnsi" w:hAnsiTheme="minorHAnsi" w:cstheme="minorHAnsi"/>
-          <w:sz w:val="22"/>
-          <w:szCs w:val="22"/>
-        </w:rPr>
-        <w:t xml:space="preserve"> flow cytometry (fc) data captured by the diagnostic assay for the detection of microRNA (miRNA) biomarkers associated with endometrial cancer.</w:t>
+        <w:t xml:space="preserve"> diagnostic assay. The aim of the software is to process, analyse, and visualise flow cytometry (fc) data captured by the diagnostic assay for the detection of microRNA (miRNA) biomarkers associated with endometrial cancer.</w:t>
       </w:r>
     </w:p>
     <w:p>
@@ -3440,25 +3336,7 @@
           <w:sz w:val="22"/>
           <w:szCs w:val="22"/>
         </w:rPr>
-        <w:t xml:space="preserve">The purpose of this document is to define the structural </w:t>
-      </w:r>
-      <w:proofErr w:type="spellStart"/>
-      <w:r>
-        <w:rPr>
-          <w:rFonts w:asciiTheme="minorHAnsi" w:hAnsiTheme="minorHAnsi" w:cstheme="minorHAnsi"/>
-          <w:sz w:val="22"/>
-          <w:szCs w:val="22"/>
-        </w:rPr>
-        <w:t>organisation</w:t>
-      </w:r>
-      <w:proofErr w:type="spellEnd"/>
-      <w:r>
-        <w:rPr>
-          <w:rFonts w:asciiTheme="minorHAnsi" w:hAnsiTheme="minorHAnsi" w:cstheme="minorHAnsi"/>
-          <w:sz w:val="22"/>
-          <w:szCs w:val="22"/>
-        </w:rPr>
-        <w:t xml:space="preserve"> of the software, including its constituent modules, data flow, interfaces, and interactions with external systems. The architecture describes how raw Flow Cytometry Standard (.fcs) data is transformed through a series of computational stages into structured outputs and diagnostic metrics.</w:t>
+        <w:t>The purpose of this document is to define the structural organisation of the software, including its constituent modules, data flow, interfaces, and interactions with external systems. The architecture describes how raw Flow Cytometry Standard (.fcs) data is transformed through a series of computational stages into structured outputs and diagnostic metrics.</w:t>
       </w:r>
     </w:p>
     <w:p>
@@ -4140,25 +4018,7 @@
                 <w:sz w:val="20"/>
                 <w:szCs w:val="20"/>
               </w:rPr>
-              <w:t>l Requirement (</w:t>
-            </w:r>
-            <w:proofErr w:type="spellStart"/>
-            <w:r>
-              <w:rPr>
-                <w:rFonts w:eastAsia="Times New Roman" w:cstheme="minorHAnsi"/>
-                <w:sz w:val="20"/>
-                <w:szCs w:val="20"/>
-              </w:rPr>
-              <w:t>cf</w:t>
-            </w:r>
-            <w:proofErr w:type="spellEnd"/>
-            <w:r>
-              <w:rPr>
-                <w:rFonts w:eastAsia="Times New Roman" w:cstheme="minorHAnsi"/>
-                <w:sz w:val="20"/>
-                <w:szCs w:val="20"/>
-              </w:rPr>
-              <w:t xml:space="preserve"> risk analysis)</w:t>
+              <w:t>l Requirement (cf risk analysis)</w:t>
             </w:r>
           </w:p>
         </w:tc>
@@ -4950,21 +4810,7 @@
         <w:rPr>
           <w:lang w:val="en-US"/>
         </w:rPr>
-        <w:t xml:space="preserve"> software architecture is designed to transform raw flow cytometry data into structured analytical outputs and clinically interpretable metrics through a modular computational pipeline. The architecture defines the </w:t>
-      </w:r>
-      <w:proofErr w:type="spellStart"/>
-      <w:r>
-        <w:rPr>
-          <w:lang w:val="en-US"/>
-        </w:rPr>
-        <w:t>organisation</w:t>
-      </w:r>
-      <w:proofErr w:type="spellEnd"/>
-      <w:r>
-        <w:rPr>
-          <w:lang w:val="en-US"/>
-        </w:rPr>
-        <w:t xml:space="preserve"> of software components, data flow between modules, and interactions with external systems.</w:t>
+        <w:t xml:space="preserve"> software architecture is designed to transform raw flow cytometry data into structured analytical outputs and clinically interpretable metrics through a modular computational pipeline. The architecture defines the organisation of software components, data flow between modules, and interactions with external systems.</w:t>
       </w:r>
     </w:p>
     <w:p>
@@ -5004,21 +4850,7 @@
         <w:rPr>
           <w:lang w:val="en-US"/>
         </w:rPr>
-        <w:t xml:space="preserve"> a standard computing environment (e.g., personal </w:t>
-      </w:r>
-      <w:proofErr w:type="gramStart"/>
-      <w:r>
-        <w:rPr>
-          <w:lang w:val="en-US"/>
-        </w:rPr>
-        <w:t>computer</w:t>
-      </w:r>
-      <w:proofErr w:type="gramEnd"/>
-      <w:r>
-        <w:rPr>
-          <w:lang w:val="en-US"/>
-        </w:rPr>
-        <w:t xml:space="preserve">). It processes </w:t>
+        <w:t xml:space="preserve"> a standard computing environment (e.g., personal computer). It processes </w:t>
       </w:r>
       <w:r>
         <w:rPr>
@@ -5072,21 +4904,7 @@
         <w:rPr>
           <w:lang w:val="en-US"/>
         </w:rPr>
-        <w:t xml:space="preserve">The software operates within a laboratory data analysis environment, where .fcs files are exported from flow cytometers and provided as input to the system. The architecture is designed to be robust to variations in data structure and instrument configurations through dynamic channel detection and </w:t>
-      </w:r>
-      <w:proofErr w:type="spellStart"/>
-      <w:r>
-        <w:rPr>
-          <w:lang w:val="en-US"/>
-        </w:rPr>
-        <w:t>standardised</w:t>
-      </w:r>
-      <w:proofErr w:type="spellEnd"/>
-      <w:r>
-        <w:rPr>
-          <w:lang w:val="en-US"/>
-        </w:rPr>
-        <w:t xml:space="preserve"> signal transformation.</w:t>
+        <w:t>The software operates within a laboratory data analysis environment, where .fcs files are exported from flow cytometers and provided as input to the system. The architecture is designed to be robust to variations in data structure and instrument configurations through dynamic channel detection and standardised signal transformation.</w:t>
       </w:r>
     </w:p>
     <w:p>
@@ -5138,21 +4956,7 @@
         <w:rPr>
           <w:lang w:val="en-US"/>
         </w:rPr>
-        <w:t>ngestion of raw .fcs files, automatic channel detection, signal transformation (logicle/</w:t>
-      </w:r>
-      <w:proofErr w:type="spellStart"/>
-      <w:r>
-        <w:rPr>
-          <w:lang w:val="en-US"/>
-        </w:rPr>
-        <w:t>asinh</w:t>
-      </w:r>
-      <w:proofErr w:type="spellEnd"/>
-      <w:r>
-        <w:rPr>
-          <w:lang w:val="en-US"/>
-        </w:rPr>
-        <w:t xml:space="preserve">), and generation of per-sample </w:t>
+        <w:t xml:space="preserve">ngestion of raw .fcs files, automatic channel detection, signal transformation (logicle/asinh), and generation of per-sample </w:t>
       </w:r>
       <w:r>
         <w:rPr>
@@ -5196,25 +5000,7 @@
           <w:bCs/>
           <w:lang w:val="en-US"/>
         </w:rPr>
-        <w:t xml:space="preserve">Module 1.5 – FCS Output </w:t>
-      </w:r>
-      <w:proofErr w:type="spellStart"/>
-      <w:r>
-        <w:rPr>
-          <w:b/>
-          <w:bCs/>
-          <w:lang w:val="en-US"/>
-        </w:rPr>
-        <w:t>Organiser</w:t>
-      </w:r>
-      <w:proofErr w:type="spellEnd"/>
-      <w:r>
-        <w:rPr>
-          <w:b/>
-          <w:bCs/>
-          <w:lang w:val="en-US"/>
-        </w:rPr>
-        <w:t>:</w:t>
+        <w:t>Module 1.5 – FCS Output Organiser:</w:t>
       </w:r>
       <w:r>
         <w:rPr>
@@ -5232,21 +5018,7 @@
         <w:rPr>
           <w:lang w:val="en-US"/>
         </w:rPr>
-        <w:t xml:space="preserve">ggregation and </w:t>
-      </w:r>
-      <w:proofErr w:type="spellStart"/>
-      <w:r>
-        <w:rPr>
-          <w:lang w:val="en-US"/>
-        </w:rPr>
-        <w:t>organisation</w:t>
-      </w:r>
-      <w:proofErr w:type="spellEnd"/>
-      <w:r>
-        <w:rPr>
-          <w:lang w:val="en-US"/>
-        </w:rPr>
-        <w:t xml:space="preserve"> of visual outputs into structured overview panels for batch-level inspection and quality control</w:t>
+        <w:t>ggregation and organisation of visual outputs into structured overview panels for batch-level inspection and quality control</w:t>
       </w:r>
       <w:r>
         <w:rPr>
@@ -6138,21 +5910,7 @@
         <w:rPr>
           <w:lang w:val="en-US"/>
         </w:rPr>
-        <w:t xml:space="preserve">In case logicle transformation fails, another commonly used approach called the </w:t>
-      </w:r>
-      <w:proofErr w:type="spellStart"/>
-      <w:r>
-        <w:rPr>
-          <w:lang w:val="en-US"/>
-        </w:rPr>
-        <w:t>asinh</w:t>
-      </w:r>
-      <w:proofErr w:type="spellEnd"/>
-      <w:r>
-        <w:rPr>
-          <w:lang w:val="en-US"/>
-        </w:rPr>
-        <w:t xml:space="preserve"> transformation will be used across all the modules. Furthermore, for low-event datasets in module 4, two components are used instead of three whilst clustering</w:t>
+        <w:t>In case logicle transformation fails, another commonly used approach called the asinh transformation will be used across all the modules. Furthermore, for low-event datasets in module 4, two components are used instead of three whilst clustering</w:t>
       </w:r>
       <w:r>
         <w:rPr>
@@ -6208,21 +5966,7 @@
         <w:rPr>
           <w:lang w:val="en-US"/>
         </w:rPr>
-        <w:t xml:space="preserve">nables manual inspection of distributions and gating </w:t>
-      </w:r>
-      <w:proofErr w:type="spellStart"/>
-      <w:r>
-        <w:rPr>
-          <w:lang w:val="en-US"/>
-        </w:rPr>
-        <w:t>behaviour</w:t>
-      </w:r>
-      <w:proofErr w:type="spellEnd"/>
-      <w:r>
-        <w:rPr>
-          <w:lang w:val="en-US"/>
-        </w:rPr>
-        <w:t xml:space="preserve"> to </w:t>
+        <w:t xml:space="preserve">nables manual inspection of distributions and gating behaviour to </w:t>
       </w:r>
       <w:r>
         <w:rPr>
@@ -6800,34 +6544,14 @@
           <w:lang w:val="en-US"/>
         </w:rPr>
       </w:pPr>
-      <w:proofErr w:type="spellStart"/>
       <w:r>
         <w:rPr>
           <w:b/>
           <w:bCs/>
           <w:lang w:val="en-US"/>
         </w:rPr>
-        <w:t>fcsparser</w:t>
-      </w:r>
-      <w:proofErr w:type="spellEnd"/>
-      <w:r>
-        <w:rPr>
-          <w:b/>
-          <w:bCs/>
-          <w:lang w:val="en-US"/>
-        </w:rPr>
-        <w:t xml:space="preserve"> and </w:t>
-      </w:r>
-      <w:proofErr w:type="spellStart"/>
-      <w:r>
-        <w:rPr>
-          <w:b/>
-          <w:bCs/>
-          <w:lang w:val="en-US"/>
-        </w:rPr>
-        <w:t>flowutils</w:t>
-      </w:r>
-      <w:proofErr w:type="spellEnd"/>
+        <w:t>fcsparser and flowutils</w:t>
+      </w:r>
       <w:r>
         <w:rPr>
           <w:lang w:val="en-US"/>
@@ -6981,21 +6705,7 @@
         <w:rPr>
           <w:lang w:val="en-US"/>
         </w:rPr>
-        <w:t xml:space="preserve">Fallback mechanisms (e.g., </w:t>
-      </w:r>
-      <w:proofErr w:type="spellStart"/>
-      <w:r>
-        <w:rPr>
-          <w:lang w:val="en-US"/>
-        </w:rPr>
-        <w:t>asinh</w:t>
-      </w:r>
-      <w:proofErr w:type="spellEnd"/>
-      <w:r>
-        <w:rPr>
-          <w:lang w:val="en-US"/>
-        </w:rPr>
-        <w:t xml:space="preserve"> transformation in place of logicle) are implemented to reduce reliance on specific libraries where possible.</w:t>
+        <w:t>Fallback mechanisms (e.g., asinh transformation in place of logicle) are implemented to reduce reliance on specific libraries where possible.</w:t>
       </w:r>
     </w:p>
     <w:p>
@@ -7780,19 +7490,11 @@
               </w:rPr>
               <w:t xml:space="preserve">to </w:t>
             </w:r>
-            <w:proofErr w:type="spellStart"/>
             <w:r>
               <w:rPr>
                 <w:lang w:val="en-US"/>
               </w:rPr>
-              <w:t>asinh</w:t>
-            </w:r>
-            <w:proofErr w:type="spellEnd"/>
-            <w:r>
-              <w:rPr>
-                <w:lang w:val="en-US"/>
-              </w:rPr>
-              <w:t>) to standardise flow cytometry data</w:t>
+              <w:t>asinh) to standardise flow cytometry data</w:t>
             </w:r>
           </w:p>
         </w:tc>
@@ -7916,21 +7618,7 @@
               <w:rPr>
                 <w:lang w:val="en-US"/>
               </w:rPr>
-              <w:t xml:space="preserve">The software shall aggregate and </w:t>
-            </w:r>
-            <w:proofErr w:type="spellStart"/>
-            <w:r>
-              <w:rPr>
-                <w:lang w:val="en-US"/>
-              </w:rPr>
-              <w:t>organise</w:t>
-            </w:r>
-            <w:proofErr w:type="spellEnd"/>
-            <w:r>
-              <w:rPr>
-                <w:lang w:val="en-US"/>
-              </w:rPr>
-              <w:t xml:space="preserve"> generated visual outputs for batch-level inspection</w:t>
+              <w:t>The software shall aggregate and organise generated visual outputs for batch-level inspection</w:t>
             </w:r>
           </w:p>
         </w:tc>
@@ -7950,16 +7638,8 @@
               <w:rPr>
                 <w:lang w:val="en-US"/>
               </w:rPr>
-              <w:t xml:space="preserve">Module 1.5 – FCS Output </w:t>
+              <w:t>Module 1.5 – FCS Output Organiser</w:t>
             </w:r>
-            <w:proofErr w:type="spellStart"/>
-            <w:r>
-              <w:rPr>
-                <w:lang w:val="en-US"/>
-              </w:rPr>
-              <w:t>Organiser</w:t>
-            </w:r>
-            <w:proofErr w:type="spellEnd"/>
           </w:p>
         </w:tc>
       </w:tr>
@@ -8963,40 +8643,68 @@
     </w:p>
     <w:p>
       <w:pPr>
-        <w:pStyle w:val="Heading3"/>
-      </w:pPr>
-      <w:bookmarkStart w:id="24" w:name="_Toc120185082"/>
-      <w:r>
-        <w:t>Hardware Component 1</w:t>
+        <w:pStyle w:val="Heading2"/>
+      </w:pPr>
+      <w:bookmarkStart w:id="24" w:name="_Toc120185083"/>
+      <w:r>
+        <w:lastRenderedPageBreak/>
+        <w:t>Software Components</w:t>
       </w:r>
       <w:bookmarkEnd w:id="24"/>
     </w:p>
     <w:p>
       <w:pPr>
-        <w:rPr>
+        <w:pStyle w:val="NormalWeb"/>
+        <w:jc w:val="both"/>
+        <w:rPr>
+          <w:rFonts w:asciiTheme="minorHAnsi" w:hAnsiTheme="minorHAnsi" w:cstheme="minorHAnsi"/>
+          <w:sz w:val="22"/>
+          <w:szCs w:val="22"/>
+        </w:rPr>
+      </w:pPr>
+      <w:r>
+        <w:rPr>
+          <w:rFonts w:asciiTheme="minorHAnsi" w:hAnsiTheme="minorHAnsi" w:cstheme="minorHAnsi"/>
+          <w:sz w:val="22"/>
+          <w:szCs w:val="22"/>
+        </w:rPr>
+        <w:t xml:space="preserve">The </w:t>
+      </w:r>
+      <w:r>
+        <w:rPr>
+          <w:rFonts w:asciiTheme="minorHAnsi" w:hAnsiTheme="minorHAnsi" w:cstheme="minorHAnsi"/>
           <w:i/>
           <w:iCs/>
-        </w:rPr>
-      </w:pPr>
-      <w:r>
-        <w:rPr>
-          <w:i/>
-          <w:iCs/>
-          <w:highlight w:val="lightGray"/>
-        </w:rPr>
-        <w:t>Describe each component. For class C, the description must contain the identification, software components received, technical characteristics, network hardware interfaces.</w:t>
-      </w:r>
-    </w:p>
-    <w:p>
-      <w:pPr>
-        <w:pStyle w:val="Heading2"/>
-      </w:pPr>
-      <w:bookmarkStart w:id="25" w:name="_Toc120185083"/>
-      <w:r>
-        <w:lastRenderedPageBreak/>
-        <w:t>Software Components</w:t>
-      </w:r>
-      <w:bookmarkEnd w:id="25"/>
+          <w:sz w:val="22"/>
+          <w:szCs w:val="22"/>
+        </w:rPr>
+        <w:t>miRFlow</w:t>
+      </w:r>
+      <w:r>
+        <w:rPr>
+          <w:rFonts w:asciiTheme="minorHAnsi" w:hAnsiTheme="minorHAnsi" w:cstheme="minorHAnsi"/>
+          <w:sz w:val="22"/>
+          <w:szCs w:val="22"/>
+        </w:rPr>
+        <w:t xml:space="preserve"> software is structured as a </w:t>
+      </w:r>
+      <w:r>
+        <w:rPr>
+          <w:rStyle w:val="Strong"/>
+          <w:rFonts w:asciiTheme="minorHAnsi" w:hAnsiTheme="minorHAnsi" w:cstheme="minorHAnsi"/>
+          <w:sz w:val="22"/>
+          <w:szCs w:val="22"/>
+        </w:rPr>
+        <w:t>modular analytical pipeline</w:t>
+      </w:r>
+      <w:r>
+        <w:rPr>
+          <w:rFonts w:asciiTheme="minorHAnsi" w:hAnsiTheme="minorHAnsi" w:cstheme="minorHAnsi"/>
+          <w:sz w:val="22"/>
+          <w:szCs w:val="22"/>
+        </w:rPr>
+        <w:t>, where each software component performs a distinct stage of data processing. The architecture is designed to ensure clear separation of responsibilities, reproducibility of results, and traceable data flow between components.</w:t>
+      </w:r>
     </w:p>
     <w:p>
       <w:pPr>
@@ -9014,25 +8722,7 @@
           <w:sz w:val="22"/>
           <w:szCs w:val="22"/>
         </w:rPr>
-        <w:t xml:space="preserve">The </w:t>
-      </w:r>
-      <w:r>
-        <w:rPr>
-          <w:rFonts w:asciiTheme="minorHAnsi" w:hAnsiTheme="minorHAnsi" w:cstheme="minorHAnsi"/>
-          <w:i/>
-          <w:iCs/>
-          <w:sz w:val="22"/>
-          <w:szCs w:val="22"/>
-        </w:rPr>
-        <w:t>miRFlow</w:t>
-      </w:r>
-      <w:r>
-        <w:rPr>
-          <w:rFonts w:asciiTheme="minorHAnsi" w:hAnsiTheme="minorHAnsi" w:cstheme="minorHAnsi"/>
-          <w:sz w:val="22"/>
-          <w:szCs w:val="22"/>
-        </w:rPr>
-        <w:t xml:space="preserve"> software is structured as a </w:t>
+        <w:t xml:space="preserve">The software is implemented in </w:t>
       </w:r>
       <w:r>
         <w:rPr>
@@ -9041,15 +8731,75 @@
           <w:sz w:val="22"/>
           <w:szCs w:val="22"/>
         </w:rPr>
-        <w:t>modular analytical pipeline</w:t>
-      </w:r>
-      <w:r>
-        <w:rPr>
-          <w:rFonts w:asciiTheme="minorHAnsi" w:hAnsiTheme="minorHAnsi" w:cstheme="minorHAnsi"/>
-          <w:sz w:val="22"/>
-          <w:szCs w:val="22"/>
-        </w:rPr>
-        <w:t>, where each software component performs a distinct stage of data processing. The architecture is designed to ensure clear separation of responsibilities, reproducibility of results, and traceable data flow between components.</w:t>
+        <w:t>Python</w:t>
+      </w:r>
+      <w:r>
+        <w:rPr>
+          <w:rFonts w:asciiTheme="minorHAnsi" w:hAnsiTheme="minorHAnsi" w:cstheme="minorHAnsi"/>
+          <w:b/>
+          <w:bCs/>
+          <w:sz w:val="22"/>
+          <w:szCs w:val="22"/>
+        </w:rPr>
+        <w:t xml:space="preserve"> </w:t>
+      </w:r>
+      <w:r>
+        <w:rPr>
+          <w:rFonts w:asciiTheme="minorHAnsi" w:hAnsiTheme="minorHAnsi" w:cstheme="minorHAnsi"/>
+          <w:b/>
+          <w:bCs/>
+          <w:sz w:val="22"/>
+          <w:szCs w:val="22"/>
+        </w:rPr>
+        <w:t>(3.x)</w:t>
+      </w:r>
+      <w:r>
+        <w:rPr>
+          <w:rFonts w:asciiTheme="minorHAnsi" w:hAnsiTheme="minorHAnsi" w:cstheme="minorHAnsi"/>
+          <w:sz w:val="22"/>
+          <w:szCs w:val="22"/>
+        </w:rPr>
+        <w:t xml:space="preserve"> </w:t>
+      </w:r>
+      <w:r>
+        <w:rPr>
+          <w:rFonts w:asciiTheme="minorHAnsi" w:hAnsiTheme="minorHAnsi" w:cstheme="minorHAnsi"/>
+          <w:sz w:val="22"/>
+          <w:szCs w:val="22"/>
+        </w:rPr>
+        <w:t xml:space="preserve">and operates </w:t>
+      </w:r>
+      <w:r>
+        <w:rPr>
+          <w:rFonts w:asciiTheme="minorHAnsi" w:hAnsiTheme="minorHAnsi" w:cstheme="minorHAnsi"/>
+          <w:sz w:val="22"/>
+          <w:szCs w:val="22"/>
+        </w:rPr>
+        <w:t>in</w:t>
+      </w:r>
+      <w:r>
+        <w:rPr>
+          <w:rFonts w:asciiTheme="minorHAnsi" w:hAnsiTheme="minorHAnsi" w:cstheme="minorHAnsi"/>
+          <w:sz w:val="22"/>
+          <w:szCs w:val="22"/>
+        </w:rPr>
+        <w:t xml:space="preserve"> a standard computing environment running a compatible operating system (e.g., Windows or macOS). The system relies on a set of scientific computing libraries for data processing, statistical modelling, and visualisation</w:t>
+      </w:r>
+      <w:r>
+        <w:rPr>
+          <w:rFonts w:asciiTheme="minorHAnsi" w:hAnsiTheme="minorHAnsi" w:cstheme="minorHAnsi"/>
+          <w:sz w:val="22"/>
+          <w:szCs w:val="22"/>
+        </w:rPr>
+        <w:t xml:space="preserve"> (see section 3.5)</w:t>
+      </w:r>
+      <w:r>
+        <w:rPr>
+          <w:rFonts w:asciiTheme="minorHAnsi" w:hAnsiTheme="minorHAnsi" w:cstheme="minorHAnsi"/>
+          <w:sz w:val="22"/>
+          <w:szCs w:val="22"/>
+        </w:rPr>
+        <w:t>.</w:t>
       </w:r>
     </w:p>
     <w:p>
@@ -9068,25 +8818,7 @@
           <w:sz w:val="22"/>
           <w:szCs w:val="22"/>
         </w:rPr>
-        <w:t xml:space="preserve">The software is </w:t>
-      </w:r>
-      <w:proofErr w:type="gramStart"/>
-      <w:r>
-        <w:rPr>
-          <w:rFonts w:asciiTheme="minorHAnsi" w:hAnsiTheme="minorHAnsi" w:cstheme="minorHAnsi"/>
-          <w:sz w:val="22"/>
-          <w:szCs w:val="22"/>
-        </w:rPr>
-        <w:t>implemented</w:t>
-      </w:r>
-      <w:proofErr w:type="gramEnd"/>
-      <w:r>
-        <w:rPr>
-          <w:rFonts w:asciiTheme="minorHAnsi" w:hAnsiTheme="minorHAnsi" w:cstheme="minorHAnsi"/>
-          <w:sz w:val="22"/>
-          <w:szCs w:val="22"/>
-        </w:rPr>
-        <w:t xml:space="preserve"> in </w:t>
+        <w:t xml:space="preserve">The software components interact through a </w:t>
       </w:r>
       <w:r>
         <w:rPr>
@@ -9095,13 +8827,19 @@
           <w:sz w:val="22"/>
           <w:szCs w:val="22"/>
         </w:rPr>
-        <w:t>Python</w:t>
-      </w:r>
-      <w:r>
-        <w:rPr>
-          <w:rFonts w:asciiTheme="minorHAnsi" w:hAnsiTheme="minorHAnsi" w:cstheme="minorHAnsi"/>
-          <w:b/>
-          <w:bCs/>
+        <w:t>sequential data pipeline</w:t>
+      </w:r>
+      <w:r>
+        <w:rPr>
+          <w:rFonts w:asciiTheme="minorHAnsi" w:hAnsiTheme="minorHAnsi" w:cstheme="minorHAnsi"/>
+          <w:sz w:val="22"/>
+          <w:szCs w:val="22"/>
+        </w:rPr>
+        <w:t>, where outputs from each module serve as inputs to subsequent modules.</w:t>
+      </w:r>
+      <w:r>
+        <w:rPr>
+          <w:rFonts w:asciiTheme="minorHAnsi" w:hAnsiTheme="minorHAnsi" w:cstheme="minorHAnsi"/>
           <w:sz w:val="22"/>
           <w:szCs w:val="22"/>
         </w:rPr>
@@ -9110,60 +8848,10 @@
       <w:r>
         <w:rPr>
           <w:rFonts w:asciiTheme="minorHAnsi" w:hAnsiTheme="minorHAnsi" w:cstheme="minorHAnsi"/>
-          <w:b/>
-          <w:bCs/>
-          <w:sz w:val="22"/>
-          <w:szCs w:val="22"/>
-        </w:rPr>
-        <w:t>(3.x)</w:t>
-      </w:r>
-      <w:r>
-        <w:rPr>
-          <w:rFonts w:asciiTheme="minorHAnsi" w:hAnsiTheme="minorHAnsi" w:cstheme="minorHAnsi"/>
-          <w:sz w:val="22"/>
-          <w:szCs w:val="22"/>
-        </w:rPr>
-        <w:t xml:space="preserve"> </w:t>
-      </w:r>
-      <w:r>
-        <w:rPr>
-          <w:rFonts w:asciiTheme="minorHAnsi" w:hAnsiTheme="minorHAnsi" w:cstheme="minorHAnsi"/>
-          <w:sz w:val="22"/>
-          <w:szCs w:val="22"/>
-        </w:rPr>
-        <w:t xml:space="preserve">and operates </w:t>
-      </w:r>
-      <w:r>
-        <w:rPr>
-          <w:rFonts w:asciiTheme="minorHAnsi" w:hAnsiTheme="minorHAnsi" w:cstheme="minorHAnsi"/>
-          <w:sz w:val="22"/>
-          <w:szCs w:val="22"/>
-        </w:rPr>
-        <w:t>in</w:t>
-      </w:r>
-      <w:r>
-        <w:rPr>
-          <w:rFonts w:asciiTheme="minorHAnsi" w:hAnsiTheme="minorHAnsi" w:cstheme="minorHAnsi"/>
-          <w:sz w:val="22"/>
-          <w:szCs w:val="22"/>
-        </w:rPr>
-        <w:t xml:space="preserve"> a standard computing environment running a compatible operating system (e.g., Windows or macOS). The system relies on a set of scientific computing libraries for data processing, statistical modelling, and visualisation</w:t>
-      </w:r>
-      <w:r>
-        <w:rPr>
-          <w:rFonts w:asciiTheme="minorHAnsi" w:hAnsiTheme="minorHAnsi" w:cstheme="minorHAnsi"/>
-          <w:sz w:val="22"/>
-          <w:szCs w:val="22"/>
-        </w:rPr>
-        <w:t xml:space="preserve"> (see section 3.5)</w:t>
-      </w:r>
-      <w:r>
-        <w:rPr>
-          <w:rFonts w:asciiTheme="minorHAnsi" w:hAnsiTheme="minorHAnsi" w:cstheme="minorHAnsi"/>
-          <w:sz w:val="22"/>
-          <w:szCs w:val="22"/>
-        </w:rPr>
-        <w:t>.</w:t>
+          <w:sz w:val="22"/>
+          <w:szCs w:val="22"/>
+        </w:rPr>
+        <w:t>The primary data flow is as follows:</w:t>
       </w:r>
     </w:p>
     <w:p>
@@ -9182,79 +8870,7 @@
           <w:sz w:val="22"/>
           <w:szCs w:val="22"/>
         </w:rPr>
-        <w:t xml:space="preserve">The software components interact through a </w:t>
-      </w:r>
-      <w:r>
-        <w:rPr>
-          <w:rStyle w:val="Strong"/>
-          <w:rFonts w:asciiTheme="minorHAnsi" w:hAnsiTheme="minorHAnsi" w:cstheme="minorHAnsi"/>
-          <w:sz w:val="22"/>
-          <w:szCs w:val="22"/>
-        </w:rPr>
-        <w:t>sequential data pipeline</w:t>
-      </w:r>
-      <w:r>
-        <w:rPr>
-          <w:rFonts w:asciiTheme="minorHAnsi" w:hAnsiTheme="minorHAnsi" w:cstheme="minorHAnsi"/>
-          <w:sz w:val="22"/>
-          <w:szCs w:val="22"/>
-        </w:rPr>
-        <w:t>, where outputs from each module serve as inputs to subsequent modules.</w:t>
-      </w:r>
-      <w:r>
-        <w:rPr>
-          <w:rFonts w:asciiTheme="minorHAnsi" w:hAnsiTheme="minorHAnsi" w:cstheme="minorHAnsi"/>
-          <w:sz w:val="22"/>
-          <w:szCs w:val="22"/>
-        </w:rPr>
-        <w:t xml:space="preserve"> </w:t>
-      </w:r>
-      <w:proofErr w:type="gramStart"/>
-      <w:r>
-        <w:rPr>
-          <w:rFonts w:asciiTheme="minorHAnsi" w:hAnsiTheme="minorHAnsi" w:cstheme="minorHAnsi"/>
-          <w:sz w:val="22"/>
-          <w:szCs w:val="22"/>
-        </w:rPr>
-        <w:t>The</w:t>
-      </w:r>
-      <w:proofErr w:type="gramEnd"/>
-      <w:r>
-        <w:rPr>
-          <w:rFonts w:asciiTheme="minorHAnsi" w:hAnsiTheme="minorHAnsi" w:cstheme="minorHAnsi"/>
-          <w:sz w:val="22"/>
-          <w:szCs w:val="22"/>
-        </w:rPr>
-        <w:t xml:space="preserve"> primary data flow is as follows:</w:t>
-      </w:r>
-    </w:p>
-    <w:p>
-      <w:pPr>
-        <w:pStyle w:val="NormalWeb"/>
-        <w:jc w:val="both"/>
-        <w:rPr>
-          <w:rFonts w:asciiTheme="minorHAnsi" w:hAnsiTheme="minorHAnsi" w:cstheme="minorHAnsi"/>
-          <w:sz w:val="22"/>
-          <w:szCs w:val="22"/>
-        </w:rPr>
-      </w:pPr>
-      <w:proofErr w:type="gramStart"/>
-      <w:r>
-        <w:rPr>
-          <w:rFonts w:asciiTheme="minorHAnsi" w:hAnsiTheme="minorHAnsi" w:cstheme="minorHAnsi"/>
-          <w:sz w:val="22"/>
-          <w:szCs w:val="22"/>
-        </w:rPr>
-        <w:t>.fcs</w:t>
-      </w:r>
-      <w:proofErr w:type="gramEnd"/>
-      <w:r>
-        <w:rPr>
-          <w:rFonts w:asciiTheme="minorHAnsi" w:hAnsiTheme="minorHAnsi" w:cstheme="minorHAnsi"/>
-          <w:sz w:val="22"/>
-          <w:szCs w:val="22"/>
-        </w:rPr>
-        <w:t xml:space="preserve"> input</w:t>
+        <w:t>.fcs input</w:t>
       </w:r>
     </w:p>
     <w:p>
@@ -9545,25 +9161,18 @@
     </w:p>
     <w:p>
       <w:pPr>
-        <w:pStyle w:val="NormalWeb"/>
-        <w:jc w:val="both"/>
-        <w:rPr>
-          <w:rFonts w:asciiTheme="minorHAnsi" w:hAnsiTheme="minorHAnsi" w:cstheme="minorHAnsi"/>
-          <w:b/>
-          <w:bCs/>
-          <w:sz w:val="22"/>
-          <w:szCs w:val="22"/>
-        </w:rPr>
-      </w:pPr>
-      <w:r>
-        <w:rPr>
-          <w:rFonts w:asciiTheme="minorHAnsi" w:hAnsiTheme="minorHAnsi" w:cstheme="minorHAnsi"/>
-          <w:b/>
-          <w:bCs/>
-          <w:sz w:val="22"/>
-          <w:szCs w:val="22"/>
-        </w:rPr>
-        <w:t>Module 1 – FCS Data Visualiser</w:t>
+        <w:pStyle w:val="Heading3"/>
+        <w:rPr>
+          <w:sz w:val="24"/>
+          <w:szCs w:val="24"/>
+        </w:rPr>
+      </w:pPr>
+      <w:r>
+        <w:rPr>
+          <w:sz w:val="24"/>
+          <w:szCs w:val="24"/>
+        </w:rPr>
+        <w:t xml:space="preserve">Module 1 – FCS Data Visualiser </w:t>
       </w:r>
     </w:p>
     <w:p>
@@ -9652,25 +9261,7 @@
           <w:szCs w:val="22"/>
         </w:rPr>
         <w:lastRenderedPageBreak/>
-        <w:t xml:space="preserve">application of signal transformation (logicle or </w:t>
-      </w:r>
-      <w:proofErr w:type="spellStart"/>
-      <w:r>
-        <w:rPr>
-          <w:rFonts w:asciiTheme="minorHAnsi" w:hAnsiTheme="minorHAnsi" w:cstheme="minorHAnsi"/>
-          <w:sz w:val="22"/>
-          <w:szCs w:val="22"/>
-        </w:rPr>
-        <w:t>asinh</w:t>
-      </w:r>
-      <w:proofErr w:type="spellEnd"/>
-      <w:r>
-        <w:rPr>
-          <w:rFonts w:asciiTheme="minorHAnsi" w:hAnsiTheme="minorHAnsi" w:cstheme="minorHAnsi"/>
-          <w:sz w:val="22"/>
-          <w:szCs w:val="22"/>
-        </w:rPr>
-        <w:t xml:space="preserve"> fallback) </w:t>
+        <w:t xml:space="preserve">application of signal transformation (logicle or asinh fallback) </w:t>
       </w:r>
     </w:p>
     <w:p>
@@ -9730,61 +9321,52 @@
           <w:sz w:val="22"/>
           <w:szCs w:val="22"/>
         </w:rPr>
-        <w:t xml:space="preserve"> of the system and ensures that input data is </w:t>
-      </w:r>
-      <w:proofErr w:type="spellStart"/>
-      <w:r>
-        <w:rPr>
-          <w:rFonts w:asciiTheme="minorHAnsi" w:hAnsiTheme="minorHAnsi" w:cstheme="minorHAnsi"/>
-          <w:sz w:val="22"/>
-          <w:szCs w:val="22"/>
-        </w:rPr>
-        <w:t>standardised</w:t>
-      </w:r>
-      <w:proofErr w:type="spellEnd"/>
-      <w:r>
-        <w:rPr>
-          <w:rFonts w:asciiTheme="minorHAnsi" w:hAnsiTheme="minorHAnsi" w:cstheme="minorHAnsi"/>
-          <w:sz w:val="22"/>
-          <w:szCs w:val="22"/>
-        </w:rPr>
-        <w:t xml:space="preserve"> for downstream analysis.</w:t>
-      </w:r>
-    </w:p>
-    <w:p>
-      <w:pPr>
-        <w:pStyle w:val="NormalWeb"/>
-        <w:jc w:val="both"/>
-        <w:rPr>
-          <w:rFonts w:asciiTheme="minorHAnsi" w:hAnsiTheme="minorHAnsi" w:cstheme="minorHAnsi"/>
-          <w:b/>
-          <w:bCs/>
-          <w:sz w:val="22"/>
-          <w:szCs w:val="22"/>
-        </w:rPr>
-      </w:pPr>
-      <w:r>
-        <w:rPr>
-          <w:rFonts w:asciiTheme="minorHAnsi" w:hAnsiTheme="minorHAnsi" w:cstheme="minorHAnsi"/>
-          <w:b/>
-          <w:bCs/>
-          <w:sz w:val="22"/>
-          <w:szCs w:val="22"/>
-        </w:rPr>
-        <w:t xml:space="preserve">Module 1.5 – FCS Output </w:t>
-      </w:r>
-      <w:proofErr w:type="spellStart"/>
-      <w:r>
-        <w:rPr>
-          <w:rFonts w:asciiTheme="minorHAnsi" w:hAnsiTheme="minorHAnsi" w:cstheme="minorHAnsi"/>
-          <w:b/>
-          <w:bCs/>
-          <w:sz w:val="22"/>
-          <w:szCs w:val="22"/>
-        </w:rPr>
-        <w:t>Organiser</w:t>
-      </w:r>
-      <w:proofErr w:type="spellEnd"/>
+        <w:t xml:space="preserve"> of the system and ensures that input data is standardised for downstream analysis.</w:t>
+      </w:r>
+    </w:p>
+    <w:p>
+      <w:pPr>
+        <w:pStyle w:val="Heading3"/>
+        <w:rPr>
+          <w:sz w:val="24"/>
+          <w:szCs w:val="24"/>
+        </w:rPr>
+      </w:pPr>
+      <w:r>
+        <w:rPr>
+          <w:sz w:val="24"/>
+          <w:szCs w:val="24"/>
+        </w:rPr>
+        <w:t>Module 1</w:t>
+      </w:r>
+      <w:r>
+        <w:rPr>
+          <w:sz w:val="24"/>
+          <w:szCs w:val="24"/>
+        </w:rPr>
+        <w:t>.5</w:t>
+      </w:r>
+      <w:r>
+        <w:rPr>
+          <w:sz w:val="24"/>
+          <w:szCs w:val="24"/>
+        </w:rPr>
+        <w:t xml:space="preserve"> – FCS </w:t>
+      </w:r>
+      <w:r>
+        <w:rPr>
+          <w:sz w:val="24"/>
+          <w:szCs w:val="24"/>
+        </w:rPr>
+        <w:t>Output Organiser</w:t>
+      </w:r>
+      <w:r>
+        <w:rPr>
+          <w:sz w:val="24"/>
+          <w:szCs w:val="24"/>
+        </w:rPr>
+        <w:t xml:space="preserve"> </w:t>
+      </w:r>
     </w:p>
     <w:p>
       <w:pPr>
@@ -9844,43 +9426,7 @@
           <w:sz w:val="22"/>
           <w:szCs w:val="22"/>
         </w:rPr>
-        <w:t xml:space="preserve">collection of </w:t>
-      </w:r>
-      <w:proofErr w:type="gramStart"/>
-      <w:r>
-        <w:rPr>
-          <w:rFonts w:asciiTheme="minorHAnsi" w:hAnsiTheme="minorHAnsi" w:cstheme="minorHAnsi"/>
-          <w:sz w:val="22"/>
-          <w:szCs w:val="22"/>
-        </w:rPr>
-        <w:t>individual</w:t>
-      </w:r>
-      <w:proofErr w:type="gramEnd"/>
-      <w:r>
-        <w:rPr>
-          <w:rFonts w:asciiTheme="minorHAnsi" w:hAnsiTheme="minorHAnsi" w:cstheme="minorHAnsi"/>
-          <w:sz w:val="22"/>
-          <w:szCs w:val="22"/>
-        </w:rPr>
-        <w:t xml:space="preserve"> .</w:t>
-      </w:r>
-      <w:proofErr w:type="spellStart"/>
-      <w:r>
-        <w:rPr>
-          <w:rFonts w:asciiTheme="minorHAnsi" w:hAnsiTheme="minorHAnsi" w:cstheme="minorHAnsi"/>
-          <w:sz w:val="22"/>
-          <w:szCs w:val="22"/>
-        </w:rPr>
-        <w:t>png</w:t>
-      </w:r>
-      <w:proofErr w:type="spellEnd"/>
-      <w:r>
-        <w:rPr>
-          <w:rFonts w:asciiTheme="minorHAnsi" w:hAnsiTheme="minorHAnsi" w:cstheme="minorHAnsi"/>
-          <w:sz w:val="22"/>
-          <w:szCs w:val="22"/>
-        </w:rPr>
-        <w:t xml:space="preserve"> outputs </w:t>
+        <w:t xml:space="preserve">collection of individual .png outputs </w:t>
       </w:r>
     </w:p>
     <w:p>
@@ -9897,23 +9443,13 @@
           <w:szCs w:val="22"/>
         </w:rPr>
       </w:pPr>
-      <w:proofErr w:type="spellStart"/>
-      <w:r>
-        <w:rPr>
-          <w:rFonts w:asciiTheme="minorHAnsi" w:hAnsiTheme="minorHAnsi" w:cstheme="minorHAnsi"/>
-          <w:sz w:val="22"/>
-          <w:szCs w:val="22"/>
-        </w:rPr>
-        <w:t>organisation</w:t>
-      </w:r>
-      <w:proofErr w:type="spellEnd"/>
-      <w:r>
-        <w:rPr>
-          <w:rFonts w:asciiTheme="minorHAnsi" w:hAnsiTheme="minorHAnsi" w:cstheme="minorHAnsi"/>
-          <w:sz w:val="22"/>
-          <w:szCs w:val="22"/>
-        </w:rPr>
-        <w:t xml:space="preserve"> into grouped categories (e.g., MMB/DG, size/fluorescence distributions) </w:t>
+      <w:r>
+        <w:rPr>
+          <w:rFonts w:asciiTheme="minorHAnsi" w:hAnsiTheme="minorHAnsi" w:cstheme="minorHAnsi"/>
+          <w:sz w:val="22"/>
+          <w:szCs w:val="22"/>
+        </w:rPr>
+        <w:t xml:space="preserve">organisation into grouped categories (e.g., MMB/DG, size/fluorescence distributions) </w:t>
       </w:r>
     </w:p>
     <w:p>
@@ -9978,25 +9514,39 @@
     </w:p>
     <w:p>
       <w:pPr>
-        <w:pStyle w:val="NormalWeb"/>
-        <w:jc w:val="both"/>
-        <w:rPr>
-          <w:rFonts w:asciiTheme="minorHAnsi" w:hAnsiTheme="minorHAnsi" w:cstheme="minorHAnsi"/>
-          <w:b/>
-          <w:bCs/>
-          <w:sz w:val="22"/>
-          <w:szCs w:val="22"/>
-        </w:rPr>
-      </w:pPr>
-      <w:r>
-        <w:rPr>
-          <w:rFonts w:asciiTheme="minorHAnsi" w:hAnsiTheme="minorHAnsi" w:cstheme="minorHAnsi"/>
-          <w:b/>
-          <w:bCs/>
-          <w:sz w:val="22"/>
-          <w:szCs w:val="22"/>
-        </w:rPr>
-        <w:t>Module 2 – Global Gating</w:t>
+        <w:pStyle w:val="Heading3"/>
+        <w:rPr>
+          <w:sz w:val="24"/>
+          <w:szCs w:val="24"/>
+        </w:rPr>
+      </w:pPr>
+      <w:r>
+        <w:rPr>
+          <w:sz w:val="24"/>
+          <w:szCs w:val="24"/>
+        </w:rPr>
+        <w:t xml:space="preserve">Module </w:t>
+      </w:r>
+      <w:r>
+        <w:rPr>
+          <w:sz w:val="24"/>
+          <w:szCs w:val="24"/>
+        </w:rPr>
+        <w:t>2</w:t>
+      </w:r>
+      <w:r>
+        <w:rPr>
+          <w:sz w:val="24"/>
+          <w:szCs w:val="24"/>
+        </w:rPr>
+        <w:t xml:space="preserve"> – </w:t>
+      </w:r>
+      <w:r>
+        <w:rPr>
+          <w:sz w:val="24"/>
+          <w:szCs w:val="24"/>
+        </w:rPr>
+        <w:t>Global Gating</w:t>
       </w:r>
     </w:p>
     <w:p>
@@ -10181,28 +9731,52 @@
         </w:rPr>
         <w:t>.</w:t>
       </w:r>
-    </w:p>
-    <w:p>
-      <w:pPr>
-        <w:pStyle w:val="NormalWeb"/>
-        <w:jc w:val="both"/>
-        <w:rPr>
-          <w:rFonts w:asciiTheme="minorHAnsi" w:hAnsiTheme="minorHAnsi" w:cstheme="minorHAnsi"/>
-          <w:b/>
-          <w:bCs/>
-          <w:sz w:val="22"/>
-          <w:szCs w:val="22"/>
-        </w:rPr>
-      </w:pPr>
-      <w:r>
-        <w:rPr>
-          <w:rFonts w:asciiTheme="minorHAnsi" w:hAnsiTheme="minorHAnsi" w:cstheme="minorHAnsi"/>
-          <w:b/>
-          <w:bCs/>
-          <w:sz w:val="22"/>
-          <w:szCs w:val="22"/>
-        </w:rPr>
-        <w:t>Module 3 – MMB Boundaries Extractor</w:t>
+      <w:r>
+        <w:t xml:space="preserve"> </w:t>
+      </w:r>
+    </w:p>
+    <w:p>
+      <w:pPr>
+        <w:pStyle w:val="Heading3"/>
+        <w:rPr>
+          <w:sz w:val="24"/>
+          <w:szCs w:val="24"/>
+        </w:rPr>
+      </w:pPr>
+      <w:r>
+        <w:rPr>
+          <w:sz w:val="24"/>
+          <w:szCs w:val="24"/>
+        </w:rPr>
+        <w:t xml:space="preserve">Module </w:t>
+      </w:r>
+      <w:r>
+        <w:rPr>
+          <w:sz w:val="24"/>
+          <w:szCs w:val="24"/>
+        </w:rPr>
+        <w:t>3</w:t>
+      </w:r>
+      <w:r>
+        <w:rPr>
+          <w:sz w:val="24"/>
+          <w:szCs w:val="24"/>
+        </w:rPr>
+        <w:t xml:space="preserve"> – </w:t>
+      </w:r>
+      <w:r>
+        <w:rPr>
+          <w:sz w:val="24"/>
+          <w:szCs w:val="24"/>
+        </w:rPr>
+        <w:t xml:space="preserve">MMB Boundaries Extractor </w:t>
+      </w:r>
+      <w:r>
+        <w:rPr>
+          <w:sz w:val="24"/>
+          <w:szCs w:val="24"/>
+        </w:rPr>
+        <w:t xml:space="preserve"> </w:t>
       </w:r>
     </w:p>
     <w:p>
@@ -10316,11 +9890,6 @@
       <w:pPr>
         <w:pStyle w:val="NormalWeb"/>
         <w:jc w:val="both"/>
-        <w:rPr>
-          <w:rFonts w:asciiTheme="minorHAnsi" w:hAnsiTheme="minorHAnsi" w:cstheme="minorHAnsi"/>
-          <w:sz w:val="22"/>
-          <w:szCs w:val="22"/>
-        </w:rPr>
       </w:pPr>
       <w:r>
         <w:rPr>
@@ -10348,6 +9917,53 @@
         </w:rPr>
         <w:t>.</w:t>
       </w:r>
+      <w:r>
+        <w:t xml:space="preserve"> </w:t>
+      </w:r>
+    </w:p>
+    <w:p>
+      <w:pPr>
+        <w:pStyle w:val="Heading3"/>
+        <w:rPr>
+          <w:sz w:val="24"/>
+          <w:szCs w:val="24"/>
+        </w:rPr>
+      </w:pPr>
+      <w:r>
+        <w:rPr>
+          <w:sz w:val="24"/>
+          <w:szCs w:val="24"/>
+        </w:rPr>
+        <w:t xml:space="preserve">Module </w:t>
+      </w:r>
+      <w:r>
+        <w:rPr>
+          <w:sz w:val="24"/>
+          <w:szCs w:val="24"/>
+        </w:rPr>
+        <w:t>4</w:t>
+      </w:r>
+      <w:r>
+        <w:rPr>
+          <w:sz w:val="24"/>
+          <w:szCs w:val="24"/>
+        </w:rPr>
+        <w:t xml:space="preserve"> – </w:t>
+      </w:r>
+      <w:r>
+        <w:rPr>
+          <w:sz w:val="24"/>
+          <w:szCs w:val="24"/>
+        </w:rPr>
+        <w:t>GMM Probabilistic Clustering</w:t>
+      </w:r>
+      <w:r>
+        <w:rPr>
+          <w:sz w:val="24"/>
+          <w:szCs w:val="24"/>
+        </w:rPr>
+        <w:t xml:space="preserve"> </w:t>
+      </w:r>
     </w:p>
     <w:p>
       <w:pPr>
@@ -10355,21 +9971,17 @@
         <w:jc w:val="both"/>
         <w:rPr>
           <w:rFonts w:asciiTheme="minorHAnsi" w:hAnsiTheme="minorHAnsi" w:cstheme="minorHAnsi"/>
-          <w:b/>
-          <w:bCs/>
-          <w:sz w:val="22"/>
-          <w:szCs w:val="22"/>
-        </w:rPr>
-      </w:pPr>
-      <w:r>
-        <w:rPr>
-          <w:rFonts w:asciiTheme="minorHAnsi" w:hAnsiTheme="minorHAnsi" w:cstheme="minorHAnsi"/>
-          <w:b/>
-          <w:bCs/>
-          <w:sz w:val="22"/>
-          <w:szCs w:val="22"/>
-        </w:rPr>
-        <w:t>Module 4 – GMM Probabilistic Clustering</w:t>
+          <w:sz w:val="22"/>
+          <w:szCs w:val="22"/>
+        </w:rPr>
+      </w:pPr>
+      <w:r>
+        <w:rPr>
+          <w:rFonts w:asciiTheme="minorHAnsi" w:hAnsiTheme="minorHAnsi" w:cstheme="minorHAnsi"/>
+          <w:sz w:val="22"/>
+          <w:szCs w:val="22"/>
+        </w:rPr>
+        <w:t>This component performs probabilistic classification of fluorescence signals.</w:t>
       </w:r>
     </w:p>
     <w:p>
@@ -10388,25 +10000,7 @@
           <w:sz w:val="22"/>
           <w:szCs w:val="22"/>
         </w:rPr>
-        <w:t>This component performs probabilistic classification of fluorescence signals.</w:t>
-      </w:r>
-    </w:p>
-    <w:p>
-      <w:pPr>
-        <w:pStyle w:val="NormalWeb"/>
-        <w:jc w:val="both"/>
-        <w:rPr>
-          <w:rFonts w:asciiTheme="minorHAnsi" w:hAnsiTheme="minorHAnsi" w:cstheme="minorHAnsi"/>
-          <w:sz w:val="22"/>
-          <w:szCs w:val="22"/>
-        </w:rPr>
-      </w:pPr>
-      <w:r>
-        <w:rPr>
-          <w:rFonts w:asciiTheme="minorHAnsi" w:hAnsiTheme="minorHAnsi" w:cstheme="minorHAnsi"/>
-          <w:sz w:val="22"/>
-          <w:szCs w:val="22"/>
-        </w:rPr>
+        <w:lastRenderedPageBreak/>
         <w:t>Its functions include:</w:t>
       </w:r>
     </w:p>
@@ -10430,7 +10024,6 @@
           <w:sz w:val="22"/>
           <w:szCs w:val="22"/>
         </w:rPr>
-        <w:lastRenderedPageBreak/>
         <w:t xml:space="preserve">application of region-of-interest gating using Module 2 outputs </w:t>
       </w:r>
     </w:p>
@@ -10565,25 +10158,18 @@
     </w:p>
     <w:p>
       <w:pPr>
-        <w:pStyle w:val="NormalWeb"/>
-        <w:jc w:val="both"/>
-        <w:rPr>
-          <w:rFonts w:asciiTheme="minorHAnsi" w:hAnsiTheme="minorHAnsi" w:cstheme="minorHAnsi"/>
-          <w:b/>
-          <w:bCs/>
-          <w:sz w:val="22"/>
-          <w:szCs w:val="22"/>
-        </w:rPr>
-      </w:pPr>
-      <w:r>
-        <w:rPr>
-          <w:rFonts w:asciiTheme="minorHAnsi" w:hAnsiTheme="minorHAnsi" w:cstheme="minorHAnsi"/>
-          <w:b/>
-          <w:bCs/>
-          <w:sz w:val="22"/>
-          <w:szCs w:val="22"/>
-        </w:rPr>
-        <w:t>Planned Component – Image-Based Event Weighting (Branch B)</w:t>
+        <w:pStyle w:val="Heading3"/>
+        <w:rPr>
+          <w:sz w:val="24"/>
+          <w:szCs w:val="24"/>
+        </w:rPr>
+      </w:pPr>
+      <w:r>
+        <w:rPr>
+          <w:sz w:val="24"/>
+          <w:szCs w:val="24"/>
+        </w:rPr>
+        <w:t xml:space="preserve">Planned Component – Image-Based Event Weighting (Branch B) </w:t>
       </w:r>
     </w:p>
     <w:p>
@@ -10885,31 +10471,13 @@
     </w:p>
     <w:p>
       <w:pPr>
-        <w:pStyle w:val="Heading3"/>
-      </w:pPr>
-      <w:bookmarkStart w:id="26" w:name="_Toc120185084"/>
-      <w:r>
-        <w:t>Software Component 1</w:t>
-      </w:r>
-      <w:bookmarkEnd w:id="26"/>
-    </w:p>
-    <w:p>
-      <w:pPr>
-        <w:rPr>
-          <w:i/>
-          <w:iCs/>
-        </w:rPr>
-      </w:pPr>
-    </w:p>
-    <w:p>
-      <w:pPr>
         <w:pStyle w:val="Heading2"/>
       </w:pPr>
-      <w:bookmarkStart w:id="27" w:name="_Toc120185085"/>
+      <w:bookmarkStart w:id="25" w:name="_Toc120185085"/>
       <w:r>
         <w:t>SOUP Items</w:t>
       </w:r>
-      <w:bookmarkEnd w:id="27"/>
+      <w:bookmarkEnd w:id="25"/>
       <w:r>
         <w:t xml:space="preserve"> </w:t>
       </w:r>
@@ -11432,14 +11000,12 @@
                 <w:lang w:val="en-US"/>
               </w:rPr>
             </w:pPr>
-            <w:proofErr w:type="spellStart"/>
             <w:r>
               <w:rPr>
                 <w:lang w:val="en-US"/>
               </w:rPr>
               <w:t>fcsparser</w:t>
             </w:r>
-            <w:proofErr w:type="spellEnd"/>
           </w:p>
         </w:tc>
         <w:tc>
@@ -11498,21 +11064,7 @@
               <w:rPr>
                 <w:lang w:val="en-US"/>
               </w:rPr>
-              <w:t xml:space="preserve">Reading and </w:t>
-            </w:r>
-            <w:proofErr w:type="gramStart"/>
-            <w:r>
-              <w:rPr>
-                <w:lang w:val="en-US"/>
-              </w:rPr>
-              <w:t>parsing .fcs</w:t>
-            </w:r>
-            <w:proofErr w:type="gramEnd"/>
-            <w:r>
-              <w:rPr>
-                <w:lang w:val="en-US"/>
-              </w:rPr>
-              <w:t xml:space="preserve"> flow cytometry files</w:t>
+              <w:t>Reading and parsing .fcs flow cytometry files</w:t>
             </w:r>
           </w:p>
         </w:tc>
@@ -11530,14 +11082,12 @@
                 <w:lang w:val="en-US"/>
               </w:rPr>
             </w:pPr>
-            <w:proofErr w:type="spellStart"/>
             <w:r>
               <w:rPr>
                 <w:lang w:val="en-US"/>
               </w:rPr>
               <w:t>flowutils</w:t>
             </w:r>
-            <w:proofErr w:type="spellEnd"/>
           </w:p>
         </w:tc>
         <w:tc>
@@ -11658,21 +11208,7 @@
         <w:rPr>
           <w:lang w:val="en-US"/>
         </w:rPr>
-        <w:t xml:space="preserve"> provide efficient handling of large datasets and support </w:t>
-      </w:r>
-      <w:proofErr w:type="spellStart"/>
-      <w:r>
-        <w:rPr>
-          <w:lang w:val="en-US"/>
-        </w:rPr>
-        <w:t>vectorised</w:t>
-      </w:r>
-      <w:proofErr w:type="spellEnd"/>
-      <w:r>
-        <w:rPr>
-          <w:lang w:val="en-US"/>
-        </w:rPr>
-        <w:t xml:space="preserve"> operations</w:t>
+        <w:t xml:space="preserve"> provide efficient handling of large datasets and support vectorised operations</w:t>
       </w:r>
       <w:r>
         <w:rPr>
@@ -11768,7 +11304,6 @@
           <w:lang w:val="en-US"/>
         </w:rPr>
       </w:pPr>
-      <w:proofErr w:type="spellStart"/>
       <w:r>
         <w:rPr>
           <w:b/>
@@ -11777,7 +11312,6 @@
         </w:rPr>
         <w:t>fcsparser</w:t>
       </w:r>
-      <w:proofErr w:type="spellEnd"/>
       <w:r>
         <w:rPr>
           <w:lang w:val="en-US"/>
@@ -11808,7 +11342,6 @@
           <w:lang w:val="en-US"/>
         </w:rPr>
       </w:pPr>
-      <w:proofErr w:type="spellStart"/>
       <w:r>
         <w:rPr>
           <w:b/>
@@ -11817,7 +11350,6 @@
         </w:rPr>
         <w:t>flowutils</w:t>
       </w:r>
-      <w:proofErr w:type="spellEnd"/>
       <w:r>
         <w:rPr>
           <w:lang w:val="en-US"/>
@@ -11880,19 +11412,7 @@
         <w:rPr>
           <w:lang w:val="en-US"/>
         </w:rPr>
-        <w:t xml:space="preserve">SOUP components are integrated directly </w:t>
-      </w:r>
-      <w:r>
-        <w:rPr>
-          <w:lang w:val="en-US"/>
-        </w:rPr>
-        <w:t>into</w:t>
-      </w:r>
-      <w:r>
-        <w:rPr>
-          <w:lang w:val="en-US"/>
-        </w:rPr>
-        <w:t xml:space="preserve"> the Python-based software modules through standard import mechanisms.</w:t>
+        <w:t>SOUP components are integrated directly into the Python-based software modules through standard import mechanisms.</w:t>
       </w:r>
     </w:p>
     <w:p>
@@ -11924,21 +11444,7 @@
         <w:rPr>
           <w:lang w:val="en-US"/>
         </w:rPr>
-        <w:t xml:space="preserve">direct use within specific modules (e.g., scikit-learn within Module 4, </w:t>
-      </w:r>
-      <w:proofErr w:type="spellStart"/>
-      <w:r>
-        <w:rPr>
-          <w:lang w:val="en-US"/>
-        </w:rPr>
-        <w:t>flowutils</w:t>
-      </w:r>
-      <w:proofErr w:type="spellEnd"/>
-      <w:r>
-        <w:rPr>
-          <w:lang w:val="en-US"/>
-        </w:rPr>
-        <w:t xml:space="preserve"> within Modules 1–2) </w:t>
+        <w:t xml:space="preserve">direct use within specific modules (e.g., scikit-learn within Module 4, flowutils within Modules 1–2) </w:t>
       </w:r>
     </w:p>
     <w:p>
@@ -11974,21 +11480,7 @@
         <w:rPr>
           <w:lang w:val="en-US"/>
         </w:rPr>
-        <w:t xml:space="preserve">use of structured data formats (NumPy arrays, Pandas </w:t>
-      </w:r>
-      <w:proofErr w:type="spellStart"/>
-      <w:r>
-        <w:rPr>
-          <w:lang w:val="en-US"/>
-        </w:rPr>
-        <w:t>DataFrames</w:t>
-      </w:r>
-      <w:proofErr w:type="spellEnd"/>
-      <w:r>
-        <w:rPr>
-          <w:lang w:val="en-US"/>
-        </w:rPr>
-        <w:t xml:space="preserve">) for internal data exchange </w:t>
+        <w:t xml:space="preserve">use of structured data formats (NumPy arrays, Pandas DataFrames) for internal data exchange </w:t>
       </w:r>
     </w:p>
     <w:p>
@@ -12274,21 +11766,7 @@
         <w:rPr>
           <w:lang w:val="en-US"/>
         </w:rPr>
-        <w:t xml:space="preserve">open-source repositories for </w:t>
-      </w:r>
-      <w:proofErr w:type="spellStart"/>
-      <w:r>
-        <w:rPr>
-          <w:lang w:val="en-US"/>
-        </w:rPr>
-        <w:t>specialised</w:t>
-      </w:r>
-      <w:proofErr w:type="spellEnd"/>
-      <w:r>
-        <w:rPr>
-          <w:lang w:val="en-US"/>
-        </w:rPr>
-        <w:t xml:space="preserve"> libraries</w:t>
+        <w:t>open-source repositories for specialised libraries</w:t>
       </w:r>
       <w:r>
         <w:rPr>
@@ -12303,7 +11781,6 @@
         <w:t xml:space="preserve"> </w:t>
       </w:r>
       <w:hyperlink r:id="rId11" w:history="1">
-        <w:proofErr w:type="spellStart"/>
         <w:r>
           <w:rPr>
             <w:rStyle w:val="Hyperlink"/>
@@ -12311,7 +11788,6 @@
           </w:rPr>
           <w:t>fcsparser</w:t>
         </w:r>
-        <w:proofErr w:type="spellEnd"/>
       </w:hyperlink>
       <w:r>
         <w:rPr>
@@ -12320,7 +11796,6 @@
         <w:t xml:space="preserve">, </w:t>
       </w:r>
       <w:hyperlink r:id="rId12" w:history="1">
-        <w:proofErr w:type="spellStart"/>
         <w:r>
           <w:rPr>
             <w:rStyle w:val="Hyperlink"/>
@@ -12328,7 +11803,6 @@
           </w:rPr>
           <w:t>flowutils</w:t>
         </w:r>
-        <w:proofErr w:type="spellEnd"/>
       </w:hyperlink>
       <w:r>
         <w:rPr>
@@ -12367,170 +11841,13 @@
     </w:p>
     <w:p>
       <w:pPr>
-        <w:pStyle w:val="Heading3"/>
-      </w:pPr>
-      <w:bookmarkStart w:id="28" w:name="_Toc120185086"/>
-      <w:r>
-        <w:t>SOUP Item 1</w:t>
-      </w:r>
-      <w:bookmarkEnd w:id="28"/>
-    </w:p>
-    <w:p>
-      <w:pPr>
-        <w:rPr>
-          <w:i/>
-          <w:iCs/>
-          <w:highlight w:val="lightGray"/>
-        </w:rPr>
-      </w:pPr>
-      <w:r>
-        <w:rPr>
-          <w:i/>
-          <w:iCs/>
-          <w:highlight w:val="lightGray"/>
-        </w:rPr>
-        <w:t>Describe the SOUP items (identification, version, origin)</w:t>
-      </w:r>
-    </w:p>
-    <w:p>
-      <w:pPr>
-        <w:rPr>
-          <w:i/>
-          <w:iCs/>
-          <w:highlight w:val="lightGray"/>
-        </w:rPr>
-      </w:pPr>
-      <w:r>
-        <w:rPr>
-          <w:i/>
-          <w:iCs/>
-          <w:highlight w:val="lightGray"/>
-        </w:rPr>
-        <w:t>Specify the functional and performance requirement for the SOUP item that are necessary for the intended use</w:t>
-      </w:r>
-      <w:r>
-        <w:rPr>
-          <w:i/>
-          <w:iCs/>
-          <w:highlight w:val="lightGray"/>
-        </w:rPr>
-        <w:t xml:space="preserve"> (which SOUP functions are used)</w:t>
-      </w:r>
-      <w:r>
-        <w:rPr>
-          <w:i/>
-          <w:iCs/>
-          <w:highlight w:val="lightGray"/>
-        </w:rPr>
-        <w:t>.</w:t>
-      </w:r>
-      <w:r>
-        <w:rPr>
-          <w:i/>
-          <w:iCs/>
-          <w:highlight w:val="lightGray"/>
-        </w:rPr>
-        <w:t xml:space="preserve"> Include any interfaces and integration method</w:t>
-      </w:r>
-      <w:r>
-        <w:rPr>
-          <w:i/>
-          <w:iCs/>
-          <w:highlight w:val="lightGray"/>
-        </w:rPr>
-        <w:t>. Identify any documentation required for COTS items.</w:t>
-      </w:r>
-    </w:p>
-    <w:p>
-      <w:pPr>
-        <w:rPr>
-          <w:i/>
-          <w:iCs/>
-        </w:rPr>
-      </w:pPr>
-      <w:r>
-        <w:rPr>
-          <w:i/>
-          <w:iCs/>
-          <w:highlight w:val="lightGray"/>
-        </w:rPr>
-        <w:t>Specify the system hardware and software necessary to support the proper operation of the SOUP item.</w:t>
-      </w:r>
-    </w:p>
-    <w:p>
-      <w:pPr>
-        <w:rPr>
-          <w:i/>
-          <w:iCs/>
-        </w:rPr>
-      </w:pPr>
-      <w:r>
-        <w:rPr>
-          <w:i/>
-          <w:iCs/>
-          <w:highlight w:val="lightGray"/>
-        </w:rPr>
-        <w:t>List any known bugs for COTS items. These should be reviewed to assess whether they can affect the user and user/patient safety (the review should be documented as a risk review</w:t>
-      </w:r>
-      <w:r>
-        <w:rPr>
-          <w:i/>
-          <w:iCs/>
-          <w:highlight w:val="lightGray"/>
-        </w:rPr>
-        <w:t xml:space="preserve"> that is referenced </w:t>
-      </w:r>
-      <w:proofErr w:type="gramStart"/>
-      <w:r>
-        <w:rPr>
-          <w:i/>
-          <w:iCs/>
-          <w:highlight w:val="lightGray"/>
-        </w:rPr>
-        <w:t>here, and</w:t>
-      </w:r>
-      <w:proofErr w:type="gramEnd"/>
-      <w:r>
-        <w:rPr>
-          <w:i/>
-          <w:iCs/>
-          <w:highlight w:val="lightGray"/>
-        </w:rPr>
-        <w:t xml:space="preserve"> r</w:t>
-      </w:r>
-      <w:r>
-        <w:rPr>
-          <w:i/>
-          <w:iCs/>
-          <w:highlight w:val="lightGray"/>
-        </w:rPr>
-        <w:t xml:space="preserve">efer to the software FMEA or risk analysis </w:t>
-      </w:r>
-      <w:r>
-        <w:rPr>
-          <w:i/>
-          <w:iCs/>
-          <w:highlight w:val="lightGray"/>
-        </w:rPr>
-        <w:t>to manage those as part of the project risk management</w:t>
-      </w:r>
-      <w:r>
-        <w:rPr>
-          <w:i/>
-          <w:iCs/>
-        </w:rPr>
-        <w:t>.</w:t>
-      </w:r>
-    </w:p>
-    <w:p>
-      <w:pPr>
         <w:pStyle w:val="Heading1"/>
       </w:pPr>
-      <w:bookmarkStart w:id="29" w:name="_Toc120185087"/>
+      <w:bookmarkStart w:id="26" w:name="_Toc120185087"/>
       <w:r>
         <w:t>DIAGRAM</w:t>
       </w:r>
-      <w:bookmarkEnd w:id="29"/>
+      <w:bookmarkEnd w:id="26"/>
     </w:p>
     <w:p>
       <w:pPr>
@@ -12606,29 +11923,24 @@
       <w:pPr>
         <w:pStyle w:val="Heading1"/>
       </w:pPr>
-      <w:bookmarkStart w:id="30" w:name="_Toc120185088"/>
+      <w:bookmarkStart w:id="27" w:name="_Toc120185088"/>
       <w:r>
         <w:t>W</w:t>
       </w:r>
       <w:r>
         <w:t>ORKFLOW</w:t>
       </w:r>
-      <w:bookmarkEnd w:id="30"/>
+      <w:bookmarkEnd w:id="27"/>
     </w:p>
     <w:p>
       <w:pPr>
         <w:pStyle w:val="Heading2"/>
       </w:pPr>
-      <w:bookmarkStart w:id="31" w:name="_Toc120185089"/>
-      <w:proofErr w:type="gramStart"/>
-      <w:r>
-        <w:t>Work Flow</w:t>
-      </w:r>
-      <w:proofErr w:type="gramEnd"/>
-      <w:r>
-        <w:t xml:space="preserve"> 1</w:t>
-      </w:r>
-      <w:bookmarkEnd w:id="31"/>
+      <w:bookmarkStart w:id="28" w:name="_Toc120185089"/>
+      <w:r>
+        <w:t>Work Flow 1</w:t>
+      </w:r>
+      <w:bookmarkEnd w:id="28"/>
     </w:p>
     <w:p>
       <w:pPr>
@@ -12770,25 +12082,7 @@
           <w:sz w:val="22"/>
           <w:szCs w:val="22"/>
         </w:rPr>
-        <w:t xml:space="preserve"> files, automatically detects the relevant size and fluorescence channels, applies signal transformation (logicle or </w:t>
-      </w:r>
-      <w:proofErr w:type="spellStart"/>
-      <w:r>
-        <w:rPr>
-          <w:rFonts w:asciiTheme="minorHAnsi" w:hAnsiTheme="minorHAnsi" w:cstheme="minorHAnsi"/>
-          <w:sz w:val="22"/>
-          <w:szCs w:val="22"/>
-        </w:rPr>
-        <w:t>asinh</w:t>
-      </w:r>
-      <w:proofErr w:type="spellEnd"/>
-      <w:r>
-        <w:rPr>
-          <w:rFonts w:asciiTheme="minorHAnsi" w:hAnsiTheme="minorHAnsi" w:cstheme="minorHAnsi"/>
-          <w:sz w:val="22"/>
-          <w:szCs w:val="22"/>
-        </w:rPr>
-        <w:t xml:space="preserve"> fallback), and generates visual representations of the raw data. This stage establishes a reproducible preprocessing layer and enables initial inspection of signal distributions.</w:t>
+        <w:t xml:space="preserve"> files, automatically detects the relevant size and fluorescence channels, applies signal transformation (logicle or asinh fallback), and generates visual representations of the raw data. This stage establishes a reproducible preprocessing layer and enables initial inspection of signal distributions.</w:t>
       </w:r>
     </w:p>
     <w:p>
@@ -12817,19 +12111,8 @@
           <w:sz w:val="22"/>
           <w:szCs w:val="22"/>
         </w:rPr>
-        <w:t xml:space="preserve">Module 1.5 – FCS Output </w:t>
-      </w:r>
-      <w:proofErr w:type="spellStart"/>
-      <w:r>
-        <w:rPr>
-          <w:rStyle w:val="Strong"/>
-          <w:rFonts w:asciiTheme="minorHAnsi" w:hAnsiTheme="minorHAnsi" w:cstheme="minorHAnsi"/>
-          <w:sz w:val="22"/>
-          <w:szCs w:val="22"/>
-        </w:rPr>
-        <w:t>Organiser</w:t>
-      </w:r>
-      <w:proofErr w:type="spellEnd"/>
+        <w:t>Module 1.5 – FCS Output Organiser</w:t>
+      </w:r>
       <w:r>
         <w:rPr>
           <w:rFonts w:asciiTheme="minorHAnsi" w:hAnsiTheme="minorHAnsi" w:cstheme="minorHAnsi"/>
@@ -12872,43 +12155,7 @@
           <w:sz w:val="22"/>
           <w:szCs w:val="22"/>
         </w:rPr>
-        <w:t xml:space="preserve"> processes control-derived datasets to define </w:t>
-      </w:r>
-      <w:proofErr w:type="spellStart"/>
-      <w:r>
-        <w:rPr>
-          <w:rFonts w:asciiTheme="minorHAnsi" w:hAnsiTheme="minorHAnsi" w:cstheme="minorHAnsi"/>
-          <w:sz w:val="22"/>
-          <w:szCs w:val="22"/>
-        </w:rPr>
-        <w:t>standardised</w:t>
-      </w:r>
-      <w:proofErr w:type="spellEnd"/>
-      <w:r>
-        <w:rPr>
-          <w:rFonts w:asciiTheme="minorHAnsi" w:hAnsiTheme="minorHAnsi" w:cstheme="minorHAnsi"/>
-          <w:sz w:val="22"/>
-          <w:szCs w:val="22"/>
-        </w:rPr>
-        <w:t xml:space="preserve"> signal boundaries for subsequent analysis. This module applies kernel density estimation (KDE) to derive global gating windows for size and fluorescence and </w:t>
-      </w:r>
-      <w:proofErr w:type="gramStart"/>
-      <w:r>
-        <w:rPr>
-          <w:rFonts w:asciiTheme="minorHAnsi" w:hAnsiTheme="minorHAnsi" w:cstheme="minorHAnsi"/>
-          <w:sz w:val="22"/>
-          <w:szCs w:val="22"/>
-        </w:rPr>
-        <w:t>exports</w:t>
-      </w:r>
-      <w:proofErr w:type="gramEnd"/>
-      <w:r>
-        <w:rPr>
-          <w:rFonts w:asciiTheme="minorHAnsi" w:hAnsiTheme="minorHAnsi" w:cstheme="minorHAnsi"/>
-          <w:sz w:val="22"/>
-          <w:szCs w:val="22"/>
-        </w:rPr>
-        <w:t xml:space="preserve"> these as structured JSON configuration files. These windows define the </w:t>
+        <w:t xml:space="preserve"> processes control-derived datasets to define standardised signal boundaries for subsequent analysis. This module applies kernel density estimation (KDE) to derive global gating windows for size and fluorescence and exports these as structured JSON configuration files. These windows define the </w:t>
       </w:r>
       <w:r>
         <w:rPr>
@@ -12997,16 +12244,7 @@
           <w:sz w:val="22"/>
           <w:szCs w:val="22"/>
         </w:rPr>
-        <w:t>, patient-</w:t>
-      </w:r>
-      <w:proofErr w:type="gramStart"/>
-      <w:r>
-        <w:rPr>
-          <w:rFonts w:asciiTheme="minorHAnsi" w:hAnsiTheme="minorHAnsi" w:cstheme="minorHAnsi"/>
-          <w:sz w:val="22"/>
-          <w:szCs w:val="22"/>
-        </w:rPr>
-        <w:t xml:space="preserve">level </w:t>
+        <w:t xml:space="preserve">, patient-level </w:t>
       </w:r>
       <w:r>
         <w:rPr>
@@ -13017,7 +12255,6 @@
         </w:rPr>
         <w:t>.fcs</w:t>
       </w:r>
-      <w:proofErr w:type="gramEnd"/>
       <w:r>
         <w:rPr>
           <w:rFonts w:asciiTheme="minorHAnsi" w:hAnsiTheme="minorHAnsi" w:cstheme="minorHAnsi"/>
@@ -13156,14 +12393,14 @@
       <w:pPr>
         <w:pStyle w:val="Heading2"/>
       </w:pPr>
-      <w:bookmarkStart w:id="32" w:name="_Toc120185090"/>
+      <w:bookmarkStart w:id="29" w:name="_Toc120185090"/>
       <w:r>
         <w:t xml:space="preserve">Necessary </w:t>
       </w:r>
       <w:r>
         <w:t>Segregation (Class C only)</w:t>
       </w:r>
-      <w:bookmarkEnd w:id="32"/>
+      <w:bookmarkEnd w:id="29"/>
     </w:p>
     <w:p>
       <w:pPr>
@@ -13212,12 +12449,12 @@
         </w:rPr>
         <w:t>will ensure that such segregation is effective.</w:t>
       </w:r>
-      <w:bookmarkStart w:id="33" w:name="_Toc65524494"/>
+      <w:bookmarkStart w:id="30" w:name="_Toc65524494"/>
       <w:bookmarkEnd w:id="11"/>
       <w:bookmarkEnd w:id="12"/>
       <w:bookmarkEnd w:id="13"/>
       <w:bookmarkEnd w:id="14"/>
-      <w:bookmarkEnd w:id="33"/>
+      <w:bookmarkEnd w:id="30"/>
     </w:p>
     <w:sectPr>
       <w:headerReference w:type="even" r:id="rId14"/>
@@ -13275,8 +12512,8 @@
       <w:tblLook w:val="04A0" w:firstRow="1" w:lastRow="0" w:firstColumn="1" w:lastColumn="0" w:noHBand="0" w:noVBand="1"/>
     </w:tblPr>
     <w:tblGrid>
-      <w:gridCol w:w="2246"/>
-      <w:gridCol w:w="4758"/>
+      <w:gridCol w:w="2245"/>
+      <w:gridCol w:w="4759"/>
       <w:gridCol w:w="2494"/>
     </w:tblGrid>
     <w:tr>
@@ -13332,7 +12569,7 @@
               <w:sz w:val="20"/>
               <w:szCs w:val="20"/>
             </w:rPr>
-            <w:t>28 March 2026</w:t>
+            <w:t>01 April 2026</w:t>
           </w:r>
           <w:r>
             <w:rPr>
@@ -13791,8 +13028,8 @@
                               </w:sdtPr>
                               <w:sdtContent/>
                             </w:sdt>
-                            <w:bookmarkStart w:id="34" w:name="_Hlk120185748"/>
-                            <w:bookmarkStart w:id="35" w:name="_Hlk536808340"/>
+                            <w:bookmarkStart w:id="31" w:name="_Hlk120185748"/>
+                            <w:bookmarkStart w:id="32" w:name="_Hlk536808340"/>
                             <w:r>
                               <w:rPr>
                                 <w:noProof/>
@@ -13856,7 +13093,6 @@
                                 <w:szCs w:val="20"/>
                               </w:rPr>
                             </w:pPr>
-                            <w:proofErr w:type="spellStart"/>
                             <w:r>
                               <w:rPr>
                                 <w:color w:val="808080" w:themeColor="background1" w:themeShade="80"/>
@@ -13871,16 +13107,7 @@
                                 <w:sz w:val="20"/>
                                 <w:szCs w:val="20"/>
                               </w:rPr>
-                              <w:t>Accelerator</w:t>
-                            </w:r>
-                            <w:proofErr w:type="spellEnd"/>
-                            <w:r>
-                              <w:rPr>
-                                <w:color w:val="808080" w:themeColor="background1" w:themeShade="80"/>
-                                <w:sz w:val="20"/>
-                                <w:szCs w:val="20"/>
-                              </w:rPr>
-                              <w:t xml:space="preserve"> QMS</w:t>
+                              <w:t>Accelerator QMS</w:t>
                             </w:r>
                           </w:p>
                           <w:p>
@@ -14086,7 +13313,7 @@
                           </w:p>
                         </w:tc>
                       </w:tr>
-                      <w:bookmarkEnd w:id="34"/>
+                      <w:bookmarkEnd w:id="31"/>
                     </w:tbl>
                     <w:p/>
                   </w:tc>
@@ -14106,7 +13333,7 @@
                     </w:p>
                   </w:tc>
                 </w:tr>
-                <w:bookmarkEnd w:id="35"/>
+                <w:bookmarkEnd w:id="32"/>
               </w:tbl>
               <w:p>
                 <w:pPr>
@@ -22223,6 +21450,156 @@
   </w:num>
   <w:num w:numId="71" w16cid:durableId="670568248">
     <w:abstractNumId w:val="13"/>
+  </w:num>
+  <w:num w:numId="72" w16cid:durableId="749348718">
+    <w:abstractNumId w:val="17"/>
+    <w:lvlOverride w:ilvl="0">
+      <w:startOverride w:val="1"/>
+    </w:lvlOverride>
+    <w:lvlOverride w:ilvl="1">
+      <w:startOverride w:val="1"/>
+    </w:lvlOverride>
+    <w:lvlOverride w:ilvl="2">
+      <w:startOverride w:val="1"/>
+    </w:lvlOverride>
+    <w:lvlOverride w:ilvl="3">
+      <w:startOverride w:val="1"/>
+    </w:lvlOverride>
+    <w:lvlOverride w:ilvl="4">
+      <w:startOverride w:val="1"/>
+    </w:lvlOverride>
+    <w:lvlOverride w:ilvl="5">
+      <w:startOverride w:val="1"/>
+    </w:lvlOverride>
+    <w:lvlOverride w:ilvl="6">
+      <w:startOverride w:val="1"/>
+    </w:lvlOverride>
+    <w:lvlOverride w:ilvl="7">
+      <w:startOverride w:val="1"/>
+    </w:lvlOverride>
+    <w:lvlOverride w:ilvl="8">
+      <w:startOverride w:val="1"/>
+    </w:lvlOverride>
+  </w:num>
+  <w:num w:numId="73" w16cid:durableId="508833893">
+    <w:abstractNumId w:val="17"/>
+    <w:lvlOverride w:ilvl="0">
+      <w:startOverride w:val="1"/>
+    </w:lvlOverride>
+    <w:lvlOverride w:ilvl="1">
+      <w:startOverride w:val="1"/>
+    </w:lvlOverride>
+    <w:lvlOverride w:ilvl="2">
+      <w:startOverride w:val="1"/>
+    </w:lvlOverride>
+    <w:lvlOverride w:ilvl="3">
+      <w:startOverride w:val="1"/>
+    </w:lvlOverride>
+    <w:lvlOverride w:ilvl="4">
+      <w:startOverride w:val="1"/>
+    </w:lvlOverride>
+    <w:lvlOverride w:ilvl="5">
+      <w:startOverride w:val="1"/>
+    </w:lvlOverride>
+    <w:lvlOverride w:ilvl="6">
+      <w:startOverride w:val="1"/>
+    </w:lvlOverride>
+    <w:lvlOverride w:ilvl="7">
+      <w:startOverride w:val="1"/>
+    </w:lvlOverride>
+    <w:lvlOverride w:ilvl="8">
+      <w:startOverride w:val="1"/>
+    </w:lvlOverride>
+  </w:num>
+  <w:num w:numId="74" w16cid:durableId="714962034">
+    <w:abstractNumId w:val="17"/>
+    <w:lvlOverride w:ilvl="0">
+      <w:startOverride w:val="1"/>
+    </w:lvlOverride>
+    <w:lvlOverride w:ilvl="1">
+      <w:startOverride w:val="1"/>
+    </w:lvlOverride>
+    <w:lvlOverride w:ilvl="2">
+      <w:startOverride w:val="1"/>
+    </w:lvlOverride>
+    <w:lvlOverride w:ilvl="3">
+      <w:startOverride w:val="1"/>
+    </w:lvlOverride>
+    <w:lvlOverride w:ilvl="4">
+      <w:startOverride w:val="1"/>
+    </w:lvlOverride>
+    <w:lvlOverride w:ilvl="5">
+      <w:startOverride w:val="1"/>
+    </w:lvlOverride>
+    <w:lvlOverride w:ilvl="6">
+      <w:startOverride w:val="1"/>
+    </w:lvlOverride>
+    <w:lvlOverride w:ilvl="7">
+      <w:startOverride w:val="1"/>
+    </w:lvlOverride>
+    <w:lvlOverride w:ilvl="8">
+      <w:startOverride w:val="1"/>
+    </w:lvlOverride>
+  </w:num>
+  <w:num w:numId="75" w16cid:durableId="1009868818">
+    <w:abstractNumId w:val="17"/>
+    <w:lvlOverride w:ilvl="0">
+      <w:startOverride w:val="1"/>
+    </w:lvlOverride>
+    <w:lvlOverride w:ilvl="1">
+      <w:startOverride w:val="1"/>
+    </w:lvlOverride>
+    <w:lvlOverride w:ilvl="2">
+      <w:startOverride w:val="1"/>
+    </w:lvlOverride>
+    <w:lvlOverride w:ilvl="3">
+      <w:startOverride w:val="1"/>
+    </w:lvlOverride>
+    <w:lvlOverride w:ilvl="4">
+      <w:startOverride w:val="1"/>
+    </w:lvlOverride>
+    <w:lvlOverride w:ilvl="5">
+      <w:startOverride w:val="1"/>
+    </w:lvlOverride>
+    <w:lvlOverride w:ilvl="6">
+      <w:startOverride w:val="1"/>
+    </w:lvlOverride>
+    <w:lvlOverride w:ilvl="7">
+      <w:startOverride w:val="1"/>
+    </w:lvlOverride>
+    <w:lvlOverride w:ilvl="8">
+      <w:startOverride w:val="1"/>
+    </w:lvlOverride>
+  </w:num>
+  <w:num w:numId="76" w16cid:durableId="792795639">
+    <w:abstractNumId w:val="17"/>
+    <w:lvlOverride w:ilvl="0">
+      <w:startOverride w:val="1"/>
+    </w:lvlOverride>
+    <w:lvlOverride w:ilvl="1">
+      <w:startOverride w:val="1"/>
+    </w:lvlOverride>
+    <w:lvlOverride w:ilvl="2">
+      <w:startOverride w:val="1"/>
+    </w:lvlOverride>
+    <w:lvlOverride w:ilvl="3">
+      <w:startOverride w:val="1"/>
+    </w:lvlOverride>
+    <w:lvlOverride w:ilvl="4">
+      <w:startOverride w:val="1"/>
+    </w:lvlOverride>
+    <w:lvlOverride w:ilvl="5">
+      <w:startOverride w:val="1"/>
+    </w:lvlOverride>
+    <w:lvlOverride w:ilvl="6">
+      <w:startOverride w:val="1"/>
+    </w:lvlOverride>
+    <w:lvlOverride w:ilvl="7">
+      <w:startOverride w:val="1"/>
+    </w:lvlOverride>
+    <w:lvlOverride w:ilvl="8">
+      <w:startOverride w:val="1"/>
+    </w:lvlOverride>
   </w:num>
 </w:numbering>
 </file>
@@ -22841,6 +22218,7 @@
   <w:style w:type="character" w:default="1" w:styleId="DefaultParagraphFont">
     <w:name w:val="Default Paragraph Font"/>
     <w:uiPriority w:val="1"/>
+    <w:semiHidden/>
     <w:unhideWhenUsed/>
   </w:style>
   <w:style w:type="table" w:default="1" w:styleId="TableNormal">

</xml_diff>